<commit_message>
Caricamento class diagram pdf
</commit_message>
<xml_diff>
--- a/documentazione/Documenti finali/Design.docx
+++ b/documentazione/Documenti finali/Design.docx
@@ -28,7 +28,6 @@
           <w:bCs/>
         </w:rPr>
       </w:pPr>
-      <w:proofErr w:type="spellStart"/>
       <w:r>
         <w:rPr>
           <w:b/>
@@ -36,7 +35,6 @@
         </w:rPr>
         <w:t>Modelling</w:t>
       </w:r>
-      <w:proofErr w:type="spellEnd"/>
     </w:p>
     <w:p>
       <w:pPr>
@@ -62,9 +60,6 @@
       <w:r>
         <w:t xml:space="preserve"> di seguito. </w:t>
       </w:r>
-      <w:r>
-        <w:t xml:space="preserve"> IMMAGINI!!!</w:t>
-      </w:r>
     </w:p>
     <w:p>
       <w:pPr>
@@ -78,16 +73,11 @@
       <w:r>
         <w:t xml:space="preserve">Use case </w:t>
       </w:r>
-      <w:proofErr w:type="spellStart"/>
       <w:r>
         <w:t>d</w:t>
       </w:r>
       <w:r>
-        <w:t>iagram</w:t>
-      </w:r>
-      <w:proofErr w:type="spellEnd"/>
-      <w:r>
-        <w:t xml:space="preserve"> : definisce i confini del sistema e le interazioni degli attori Utente ed Admin</w:t>
+        <w:t>iagram : definisce i confini del sistema e le interazioni degli attori Utente ed Admin</w:t>
       </w:r>
     </w:p>
     <w:p>
@@ -108,11 +98,9 @@
       <w:r>
         <w:t xml:space="preserve">Class </w:t>
       </w:r>
-      <w:proofErr w:type="spellStart"/>
       <w:r>
         <w:t>diagram</w:t>
       </w:r>
-      <w:proofErr w:type="spellEnd"/>
       <w:r>
         <w:t xml:space="preserve"> : rappr</w:t>
       </w:r>
@@ -153,11 +141,9 @@
       <w:r>
         <w:t xml:space="preserve"> </w:t>
       </w:r>
-      <w:proofErr w:type="spellStart"/>
       <w:r>
         <w:t>diagram</w:t>
       </w:r>
-      <w:proofErr w:type="spellEnd"/>
       <w:r>
         <w:t>: modellato il flusso dell’accesso e della prenotazione</w:t>
       </w:r>
@@ -177,19 +163,12 @@
         </w:numPr>
         <w:spacing w:after="0"/>
       </w:pPr>
-      <w:proofErr w:type="spellStart"/>
-      <w:r>
-        <w:t>Sequence</w:t>
-      </w:r>
-      <w:proofErr w:type="spellEnd"/>
-      <w:r>
-        <w:t xml:space="preserve"> </w:t>
-      </w:r>
-      <w:proofErr w:type="spellStart"/>
+      <w:r>
+        <w:t xml:space="preserve">Sequence </w:t>
+      </w:r>
       <w:r>
         <w:t>diagram</w:t>
       </w:r>
-      <w:proofErr w:type="spellEnd"/>
       <w:r>
         <w:t>: rappresenta flusso di messaggi dal ten</w:t>
       </w:r>
@@ -217,19 +196,12 @@
         </w:numPr>
         <w:spacing w:after="0"/>
       </w:pPr>
-      <w:proofErr w:type="spellStart"/>
-      <w:r>
-        <w:t>Communication</w:t>
-      </w:r>
-      <w:proofErr w:type="spellEnd"/>
-      <w:r>
-        <w:t xml:space="preserve"> </w:t>
-      </w:r>
-      <w:proofErr w:type="spellStart"/>
+      <w:r>
+        <w:t xml:space="preserve">Communication </w:t>
+      </w:r>
       <w:r>
         <w:t>diagram</w:t>
       </w:r>
-      <w:proofErr w:type="spellEnd"/>
       <w:r>
         <w:t>: rappresenta flusso di messaggi dal ten</w:t>
       </w:r>
@@ -240,21 +212,8 @@
         <w:t>ativo di prenotazione alla sua conferma</w:t>
       </w:r>
       <w:r>
-        <w:t xml:space="preserve"> in maniera alternativa al </w:t>
-      </w:r>
-      <w:proofErr w:type="spellStart"/>
-      <w:r>
-        <w:t>sequence</w:t>
-      </w:r>
-      <w:proofErr w:type="spellEnd"/>
-      <w:r>
-        <w:t xml:space="preserve"> </w:t>
-      </w:r>
-      <w:proofErr w:type="spellStart"/>
-      <w:r>
-        <w:t>diagram</w:t>
-      </w:r>
-      <w:proofErr w:type="spellEnd"/>
+        <w:t xml:space="preserve"> in maniera alternativa al sequence diagram</w:t>
+      </w:r>
     </w:p>
     <w:p>
       <w:pPr>
@@ -273,14 +232,12 @@
       <w:r>
         <w:t xml:space="preserve">Activity </w:t>
       </w:r>
-      <w:proofErr w:type="spellStart"/>
       <w:r>
         <w:t>D</w:t>
       </w:r>
       <w:r>
         <w:t>iagram</w:t>
       </w:r>
-      <w:proofErr w:type="spellEnd"/>
       <w:r>
         <w:t>: descrive il flusso completo dell’utente all’interno dell’applicazione, dall’accesso sino alla conferma della prenotazione</w:t>
       </w:r>
@@ -302,14 +259,12 @@
       <w:r>
         <w:t xml:space="preserve">Component </w:t>
       </w:r>
-      <w:proofErr w:type="spellStart"/>
       <w:r>
         <w:t>D</w:t>
       </w:r>
       <w:r>
         <w:t>iagram</w:t>
       </w:r>
-      <w:proofErr w:type="spellEnd"/>
       <w:r>
         <w:t>: illustra l’architettura del sistema e le dipendenze tra le varie componenti, sia interne che esterne</w:t>
       </w:r>
@@ -331,22 +286,15 @@
       <w:r>
         <w:t xml:space="preserve">Package </w:t>
       </w:r>
-      <w:proofErr w:type="spellStart"/>
       <w:r>
         <w:t>D</w:t>
       </w:r>
       <w:r>
         <w:t>iagram</w:t>
       </w:r>
-      <w:proofErr w:type="spellEnd"/>
-      <w:r>
-        <w:t xml:space="preserve">: visualizza l’organizzazione dei pacchetti java, senza creare cicli per garantire un codice pulito e </w:t>
-      </w:r>
-      <w:proofErr w:type="spellStart"/>
-      <w:r>
-        <w:t>manutenibile</w:t>
-      </w:r>
-      <w:proofErr w:type="spellEnd"/>
+      <w:r>
+        <w:t>: visualizza l’organizzazione dei pacchetti java, senza creare cicli per garantire un codice pulito e manutenibile</w:t>
+      </w:r>
     </w:p>
     <w:p>
       <w:pPr>
@@ -365,29 +313,14 @@
         <w:spacing w:after="0"/>
       </w:pPr>
       <w:r>
-        <w:t>I file presenti in questo documento sono ritrovabili anche all’interno della cartella del codice (</w:t>
-      </w:r>
-      <w:proofErr w:type="spellStart"/>
-      <w:r>
-        <w:t>find</w:t>
-      </w:r>
-      <w:proofErr w:type="spellEnd"/>
-      <w:r>
-        <w:t>-n-</w:t>
-      </w:r>
-      <w:proofErr w:type="spellStart"/>
-      <w:r>
-        <w:t>charge</w:t>
-      </w:r>
-      <w:proofErr w:type="spellEnd"/>
-      <w:r>
-        <w:t>/</w:t>
-      </w:r>
-      <w:proofErr w:type="spellStart"/>
-      <w:r>
-        <w:t>diagrammiUML</w:t>
-      </w:r>
-      <w:proofErr w:type="spellEnd"/>
+        <w:t xml:space="preserve">I </w:t>
+      </w:r>
+      <w:r>
+        <w:t>diagrammi</w:t>
+      </w:r>
+      <w:r>
+        <w:t xml:space="preserve"> presenti in questo documento sono ritrovabili all’interno della cartella del codice (find-n-charge/diagrammiUML</w:t>
+      </w:r>
       <w:r>
         <w:t>)</w:t>
       </w:r>
@@ -529,28 +462,12 @@
     </w:p>
     <w:p>
       <w:r>
-        <w:t>Stile architetturale: il software utilizza un architettura a strati (</w:t>
-      </w:r>
-      <w:proofErr w:type="spellStart"/>
-      <w:r>
-        <w:t>layered</w:t>
-      </w:r>
-      <w:proofErr w:type="spellEnd"/>
-      <w:r>
-        <w:t>) per garantire la separazione delle responsabilità e facilitare la manutenibilità.</w:t>
-      </w:r>
-    </w:p>
-    <w:p>
-      <w:r>
-        <w:t xml:space="preserve">Il sistema è diviso in tre </w:t>
-      </w:r>
-      <w:proofErr w:type="spellStart"/>
-      <w:r>
-        <w:t>layer</w:t>
-      </w:r>
-      <w:proofErr w:type="spellEnd"/>
-      <w:r>
-        <w:t xml:space="preserve"> principali:</w:t>
+        <w:t>Stile architetturale: il software utilizza un architettura a strati (layered) per garantire la separazione delle responsabilità e facilitare la manutenibilità.</w:t>
+      </w:r>
+    </w:p>
+    <w:p>
+      <w:r>
+        <w:t>Il sistema è diviso in tre layer principali:</w:t>
       </w:r>
     </w:p>
     <w:p>
@@ -563,23 +480,7 @@
         <w:spacing w:line="360" w:lineRule="auto"/>
       </w:pPr>
       <w:r>
-        <w:t>Presentation Layer (</w:t>
-      </w:r>
-      <w:proofErr w:type="spellStart"/>
-      <w:r>
-        <w:t>Views</w:t>
-      </w:r>
-      <w:proofErr w:type="spellEnd"/>
-      <w:r>
-        <w:t>): Gestione dell'interfaccia utente (</w:t>
-      </w:r>
-      <w:proofErr w:type="spellStart"/>
-      <w:r>
-        <w:t>Vaadin</w:t>
-      </w:r>
-      <w:proofErr w:type="spellEnd"/>
-      <w:r>
-        <w:t>)</w:t>
+        <w:t>Presentation Layer (Views): Gestione dell'interfaccia utente (Vaadin)</w:t>
       </w:r>
       <w:r>
         <w:t xml:space="preserve">. </w:t>
@@ -608,15 +509,7 @@
         <w:spacing w:line="360" w:lineRule="auto"/>
       </w:pPr>
       <w:r>
-        <w:t xml:space="preserve">Data Access Layer (Interface + </w:t>
-      </w:r>
-      <w:proofErr w:type="spellStart"/>
-      <w:r>
-        <w:t>FirebaseService</w:t>
-      </w:r>
-      <w:proofErr w:type="spellEnd"/>
-      <w:r>
-        <w:t>): Gestione dati.</w:t>
+        <w:t>Data Access Layer (Interface + FirebaseService): Gestione dati.</w:t>
       </w:r>
     </w:p>
     <w:p>
@@ -642,21 +535,8 @@
         <w:spacing w:line="360" w:lineRule="auto"/>
       </w:pPr>
       <w:r>
-        <w:t xml:space="preserve">Componenti principali: oggetti, Firebase, Client Browser, Spring, </w:t>
-      </w:r>
-      <w:proofErr w:type="spellStart"/>
-      <w:r>
-        <w:t>backend</w:t>
-      </w:r>
-      <w:proofErr w:type="spellEnd"/>
-      <w:r>
-        <w:t xml:space="preserve"> </w:t>
-      </w:r>
-      <w:proofErr w:type="spellStart"/>
-      <w:r>
-        <w:t>Vaadin</w:t>
-      </w:r>
-      <w:proofErr w:type="spellEnd"/>
+        <w:t>Componenti principali: oggetti, Firebase, Client Browser, Spring, backend Vaadin</w:t>
+      </w:r>
     </w:p>
     <w:p>
       <w:pPr>
@@ -710,15 +590,7 @@
         <w:spacing w:line="360" w:lineRule="auto"/>
       </w:pPr>
       <w:r>
-        <w:t xml:space="preserve">Dipendenze Spring – per il corretto funzionamento di </w:t>
-      </w:r>
-      <w:proofErr w:type="spellStart"/>
-      <w:r>
-        <w:t>SpringBoot</w:t>
-      </w:r>
-      <w:proofErr w:type="spellEnd"/>
-      <w:r>
-        <w:t xml:space="preserve"> e Tomcat</w:t>
+        <w:t>Dipendenze Spring – per il corretto funzionamento di SpringBoot e Tomcat</w:t>
       </w:r>
     </w:p>
     <w:p>
@@ -731,15 +603,7 @@
         <w:spacing w:line="360" w:lineRule="auto"/>
       </w:pPr>
       <w:r>
-        <w:t xml:space="preserve">Dipendenze </w:t>
-      </w:r>
-      <w:proofErr w:type="spellStart"/>
-      <w:r>
-        <w:t>Zxing</w:t>
-      </w:r>
-      <w:proofErr w:type="spellEnd"/>
-      <w:r>
-        <w:t xml:space="preserve"> – per la generazione dei QR code</w:t>
+        <w:t>Dipendenze Zxing – per la generazione dei QR code</w:t>
       </w:r>
     </w:p>
     <w:p>
@@ -752,15 +616,7 @@
         <w:spacing w:line="360" w:lineRule="auto"/>
       </w:pPr>
       <w:r>
-        <w:t xml:space="preserve">Dipendenze </w:t>
-      </w:r>
-      <w:proofErr w:type="spellStart"/>
-      <w:r>
-        <w:t>BCrypt</w:t>
-      </w:r>
-      <w:proofErr w:type="spellEnd"/>
-      <w:r>
-        <w:t xml:space="preserve"> – per la gestione di password criptate</w:t>
+        <w:t>Dipendenze BCrypt – per la gestione di password criptate</w:t>
       </w:r>
     </w:p>
     <w:p>
@@ -772,13 +628,8 @@
         </w:numPr>
         <w:spacing w:line="360" w:lineRule="auto"/>
       </w:pPr>
-      <w:proofErr w:type="spellStart"/>
-      <w:r>
-        <w:t>ApexCharts</w:t>
-      </w:r>
-      <w:proofErr w:type="spellEnd"/>
-      <w:r>
-        <w:t xml:space="preserve"> – per grafici e statistiche</w:t>
+      <w:r>
+        <w:t>ApexCharts – per grafici e statistiche</w:t>
       </w:r>
     </w:p>
     <w:p>
@@ -790,19 +641,9 @@
         </w:numPr>
         <w:spacing w:line="360" w:lineRule="auto"/>
       </w:pPr>
-      <w:proofErr w:type="spellStart"/>
-      <w:r>
-        <w:t>Vaadin</w:t>
-      </w:r>
-      <w:proofErr w:type="spellEnd"/>
-      <w:r>
-        <w:t xml:space="preserve"> – per completa gestione </w:t>
-      </w:r>
-      <w:proofErr w:type="spellStart"/>
-      <w:r>
-        <w:t>frontend</w:t>
-      </w:r>
-      <w:proofErr w:type="spellEnd"/>
+      <w:r>
+        <w:t>Vaadin – per completa gestione frontend</w:t>
+      </w:r>
     </w:p>
     <w:p>
       <w:pPr>
@@ -935,37 +776,8 @@
         <w:t xml:space="preserve"> Pattern</w:t>
       </w:r>
       <w:r>
-        <w:t xml:space="preserve">: utilizzo di </w:t>
-      </w:r>
-      <w:proofErr w:type="spellStart"/>
-      <w:r>
-        <w:t>addClickListener</w:t>
-      </w:r>
-      <w:proofErr w:type="spellEnd"/>
-      <w:r>
-        <w:t xml:space="preserve"> per </w:t>
-      </w:r>
-      <w:proofErr w:type="spellStart"/>
-      <w:r>
-        <w:t>frontend</w:t>
-      </w:r>
-      <w:proofErr w:type="spellEnd"/>
-      <w:r>
-        <w:t xml:space="preserve"> e </w:t>
-      </w:r>
-      <w:proofErr w:type="spellStart"/>
-      <w:r>
-        <w:t>ValueEventListener</w:t>
-      </w:r>
-      <w:proofErr w:type="spellEnd"/>
-      <w:r>
-        <w:t xml:space="preserve"> per </w:t>
-      </w:r>
-      <w:proofErr w:type="spellStart"/>
-      <w:r>
-        <w:t>backend</w:t>
-      </w:r>
-      <w:proofErr w:type="spellEnd"/>
+        <w:t>: utilizzo di addClickListener per frontend e ValueEventListener per backend</w:t>
+      </w:r>
     </w:p>
     <w:p/>
     <w:p>
@@ -1130,15 +942,7 @@
               <w:t>ELOC</w:t>
             </w:r>
             <w:r>
-              <w:t xml:space="preserve"> (</w:t>
-            </w:r>
-            <w:proofErr w:type="spellStart"/>
-            <w:r>
-              <w:t>Estimated</w:t>
-            </w:r>
-            <w:proofErr w:type="spellEnd"/>
-            <w:r>
-              <w:t xml:space="preserve"> Lines of Code)</w:t>
+              <w:t xml:space="preserve"> (Estimated Lines of Code)</w:t>
             </w:r>
           </w:p>
         </w:tc>
@@ -1274,15 +1078,7 @@
               <w:t>McCabe</w:t>
             </w:r>
             <w:r>
-              <w:t xml:space="preserve"> (Complessità </w:t>
-            </w:r>
-            <w:proofErr w:type="spellStart"/>
-            <w:r>
-              <w:t>Ciclomatica</w:t>
-            </w:r>
-            <w:proofErr w:type="spellEnd"/>
-            <w:r>
-              <w:t>)</w:t>
+              <w:t xml:space="preserve"> (Complessità Ciclomatica)</w:t>
             </w:r>
           </w:p>
         </w:tc>
@@ -1340,7 +1136,6 @@
             <w:pPr>
               <w:spacing w:after="160" w:line="259" w:lineRule="auto"/>
             </w:pPr>
-            <w:proofErr w:type="spellStart"/>
             <w:r>
               <w:rPr>
                 <w:b/>
@@ -1348,7 +1143,6 @@
               </w:rPr>
               <w:t>Pollution</w:t>
             </w:r>
-            <w:proofErr w:type="spellEnd"/>
           </w:p>
         </w:tc>
         <w:tc>
@@ -1389,15 +1183,7 @@
               <w:t xml:space="preserve"> Valore influenzato </w:t>
             </w:r>
             <w:r>
-              <w:t xml:space="preserve">dall’utilizzo di </w:t>
-            </w:r>
-            <w:proofErr w:type="spellStart"/>
-            <w:r>
-              <w:t>Vaadin</w:t>
-            </w:r>
-            <w:proofErr w:type="spellEnd"/>
-            <w:r>
-              <w:t>.</w:t>
+              <w:t>dall’utilizzo di Vaadin.</w:t>
             </w:r>
           </w:p>
         </w:tc>
@@ -1430,21 +1216,12 @@
             <w:pPr>
               <w:spacing w:after="160" w:line="259" w:lineRule="auto"/>
             </w:pPr>
-            <w:proofErr w:type="spellStart"/>
             <w:r>
               <w:rPr>
                 <w:b/>
                 <w:bCs/>
               </w:rPr>
-              <w:t>Tangled</w:t>
-            </w:r>
-            <w:proofErr w:type="spellEnd"/>
-            <w:r>
-              <w:rPr>
-                <w:b/>
-                <w:bCs/>
-              </w:rPr>
-              <w:t xml:space="preserve"> Libraries</w:t>
+              <w:t>Tangled Libraries</w:t>
             </w:r>
           </w:p>
         </w:tc>
@@ -1542,15 +1319,7 @@
               <w:spacing w:after="160" w:line="259" w:lineRule="auto"/>
             </w:pPr>
             <w:r>
-              <w:t xml:space="preserve">Progetto bilanciato nella "Main </w:t>
-            </w:r>
-            <w:proofErr w:type="spellStart"/>
-            <w:r>
-              <w:t>Sequence</w:t>
-            </w:r>
-            <w:proofErr w:type="spellEnd"/>
-            <w:r>
-              <w:t>" (Stabilità vs Astrazione).</w:t>
+              <w:t>Progetto bilanciato nella "Main Sequence" (Stabilità vs Astrazione).</w:t>
             </w:r>
           </w:p>
         </w:tc>
@@ -1591,23 +1360,7 @@
               <w:t>CBO</w:t>
             </w:r>
             <w:r>
-              <w:t xml:space="preserve"> (</w:t>
-            </w:r>
-            <w:proofErr w:type="spellStart"/>
-            <w:r>
-              <w:t>Coupling</w:t>
-            </w:r>
-            <w:proofErr w:type="spellEnd"/>
-            <w:r>
-              <w:t xml:space="preserve"> </w:t>
-            </w:r>
-            <w:proofErr w:type="spellStart"/>
-            <w:r>
-              <w:t>Between</w:t>
-            </w:r>
-            <w:proofErr w:type="spellEnd"/>
-            <w:r>
-              <w:t xml:space="preserve"> Objects)</w:t>
+              <w:t xml:space="preserve"> (Coupling Between Objects)</w:t>
             </w:r>
           </w:p>
         </w:tc>
@@ -1673,15 +1426,7 @@
               <w:t>WMC</w:t>
             </w:r>
             <w:r>
-              <w:t xml:space="preserve"> (</w:t>
-            </w:r>
-            <w:proofErr w:type="spellStart"/>
-            <w:r>
-              <w:t>Weighted</w:t>
-            </w:r>
-            <w:proofErr w:type="spellEnd"/>
-            <w:r>
-              <w:t xml:space="preserve"> Methods per Class)</w:t>
+              <w:t xml:space="preserve"> (Weighted Methods per Class)</w:t>
             </w:r>
           </w:p>
         </w:tc>
@@ -1747,15 +1492,7 @@
               <w:t>DIT</w:t>
             </w:r>
             <w:r>
-              <w:t xml:space="preserve"> (Depth of </w:t>
-            </w:r>
-            <w:proofErr w:type="spellStart"/>
-            <w:r>
-              <w:t>Inheritance</w:t>
-            </w:r>
-            <w:proofErr w:type="spellEnd"/>
-            <w:r>
-              <w:t xml:space="preserve"> Tree)</w:t>
+              <w:t xml:space="preserve"> (Depth of Inheritance Tree)</w:t>
             </w:r>
           </w:p>
         </w:tc>
@@ -1821,15 +1558,7 @@
               <w:t>RFC</w:t>
             </w:r>
             <w:r>
-              <w:t xml:space="preserve"> (</w:t>
-            </w:r>
-            <w:proofErr w:type="spellStart"/>
-            <w:r>
-              <w:t>Response</w:t>
-            </w:r>
-            <w:proofErr w:type="spellEnd"/>
-            <w:r>
-              <w:t xml:space="preserve"> For a Class)</w:t>
+              <w:t xml:space="preserve"> (Response For a Class)</w:t>
             </w:r>
           </w:p>
         </w:tc>
@@ -1942,16 +1671,11 @@
       <w:pPr>
         <w:jc w:val="both"/>
       </w:pPr>
-      <w:proofErr w:type="spellStart"/>
       <w:r>
         <w:t>Po</w:t>
       </w:r>
       <w:r>
-        <w:t>llution</w:t>
-      </w:r>
-      <w:proofErr w:type="spellEnd"/>
-      <w:r>
-        <w:t xml:space="preserve">: </w:t>
+        <w:t xml:space="preserve">llution: </w:t>
       </w:r>
     </w:p>
     <w:p>

</xml_diff>